<commit_message>
anno: metadados do AADR; documentacao e relatorio atualizados
</commit_message>
<xml_diff>
--- a/docs/relatorios/o_que_os_dados_permitem_perguntar.docx
+++ b/docs/relatorios/o_que_os_dados_permitem_perguntar.docx
@@ -108,20 +108,7 @@
           <w:sz w:val="22"/>
           <w:szCs w:val="22"/>
         </w:rPr>
-        <w:t xml:space="preserve">Para responder, construí uma ferramenta, o Alcance Genômico, que cruza quatro fontes públicas: as doenças e seus sintomas (HPO), os genes de cada doença (HPO), as alterações no DNA que causam cada doença (ClinVar) e as posições que o painel 1240K do AADR realmente lê.</w:t>
-      </w:r>
-    </w:p>
-    <w:p>
-      <w:pPr>
-        <w:spacing w:after="120" w:line="276"/>
-      </w:pPr>
-      <w:r>
-        <w:rPr>
-          <w:rFonts w:ascii="Calibri" w:cs="Calibri" w:eastAsia="Calibri" w:hAnsi="Calibri"/>
-          <w:sz w:val="22"/>
-          <w:szCs w:val="22"/>
-        </w:rPr>
-        <w:t xml:space="preserve">O painel 1240K é a lista fixa de 1,2 milhão de posições do DNA que o AADR lê em cada indivíduo antigo. Neste documento, "painel" tem sempre esse sentido.</w:t>
+        <w:t xml:space="preserve">Para responder, construí uma ferramenta que cruza quatro fontes públicas: as doenças e seus sintomas (HPO), os genes de cada doença (HPO), as alterações no DNA que causam cada doença (ClinVar) e as posições que o painel de DNA antigo realmente lê (AADR).</w:t>
       </w:r>
     </w:p>
     <w:p>
@@ -164,7 +151,7 @@
           <w:sz w:val="22"/>
           <w:szCs w:val="22"/>
         </w:rPr>
-        <w:t xml:space="preserve">Das 178.934 variantes patogênicas conhecidas, só 54 estão em posições que o painel 1240K lê, com os alelos certos. Elas se concentram em 17 genes.</w:t>
+        <w:t xml:space="preserve">Das 178.934 variantes patogênicas conhecidas, só 54 estão em posições que o painel lê, com os alelos certos. Elas se concentram em 17 genes.</w:t>
       </w:r>
     </w:p>
     <w:p>
@@ -499,7 +486,7 @@
                 <w:sz w:val="18"/>
                 <w:szCs w:val="18"/>
               </w:rPr>
-              <w:t xml:space="preserve">Caracterizei o painel 1240K, verifiquei a versão do genoma e cruzei com o ClinVar</w:t>
+              <w:t xml:space="preserve">Caracterizei o painel, verifiquei a versão do genoma e cruzei com o ClinVar</w:t>
             </w:r>
           </w:p>
         </w:tc>
@@ -1049,6 +1036,11 @@
           <w:szCs w:val="18"/>
         </w:rPr>
         <w:t xml:space="preserve">Tabela 1. Versões e hashes de cada arquivo estão registrados nos manifestos do repositório.</w:t>
+      </w:r>
+    </w:p>
+    <w:p>
+      <w:r>
+        <w:br w:type="page"/>
       </w:r>
     </w:p>
     <w:p>
@@ -1092,7 +1084,7 @@
           <w:sz w:val="22"/>
           <w:szCs w:val="22"/>
         </w:rPr>
-        <w:t xml:space="preserve">A pergunta do cruzamento: quantas variantes patogênicas caem numa posição que o painel 1240K lê, </w:t>
+        <w:t xml:space="preserve">A pergunta do cruzamento: quantas variantes patogênicas caem numa posição que o painel lê, </w:t>
       </w:r>
       <w:r>
         <w:rPr>
@@ -1110,7 +1102,7 @@
           <w:sz w:val="22"/>
           <w:szCs w:val="22"/>
         </w:rPr>
-        <w:t xml:space="preserve">? Exigir o alelo é necessário: se o painel 1240K pergunta "G ou A?" numa posição e a variante é G→T, ele está no lugar certo mas nunca vê o T.</w:t>
+        <w:t xml:space="preserve">? Exigir o alelo é necessário: se o painel pergunta "G ou A?" numa posição e a variante é G→T, ele está no lugar certo mas nunca vê o T.</w:t>
       </w:r>
     </w:p>
     <w:tbl>
@@ -1301,7 +1293,7 @@
                 <w:sz w:val="20"/>
                 <w:szCs w:val="20"/>
               </w:rPr>
-              <w:t xml:space="preserve">Em posição lida pelo painel 1240K</w:t>
+              <w:t xml:space="preserve">Em posição lida pelo painel</w:t>
             </w:r>
           </w:p>
         </w:tc>
@@ -1561,7 +1553,7 @@
           <w:sz w:val="18"/>
           <w:szCs w:val="18"/>
         </w:rPr>
-        <w:t xml:space="preserve">Tabela 2. Em 91% das doenças, a variante causadora é conhecida, mas está numa posição que o painel 1240K não lê.</w:t>
+        <w:t xml:space="preserve">Tabela 2. Em 91% das doenças, a variante causadora é conhecida, mas está numa posição que o painel não lê.</w:t>
       </w:r>
     </w:p>
     <w:p>
@@ -1604,7 +1596,7 @@
           <w:sz w:val="22"/>
           <w:szCs w:val="22"/>
         </w:rPr>
-        <w:t xml:space="preserve">Se as variantes caíssem ao acaso, o esperado seriam cerca de 71 no painel 1240K. Caíram 108: é o comportamento de um painel que não foi feito para doença.</w:t>
+        <w:t xml:space="preserve">Se as variantes caíssem ao acaso, o esperado seriam cerca de 71 no painel. Caíram 108: é o comportamento de um painel que não foi feito para doença.</w:t>
       </w:r>
     </w:p>
     <w:p>
@@ -1660,7 +1652,7 @@
           <w:sz w:val="22"/>
           <w:szCs w:val="22"/>
         </w:rPr>
-        <w:t xml:space="preserve">Aparecem anemia falciforme e talassemias (HBB), favismo (G6PD), fenilcetonúria (PAH). Vários desses genes estão no painel 1240K por serem alvos clássicos de estudos de seleção natural.</w:t>
+        <w:t xml:space="preserve">Aparecem anemia falciforme e talassemias (HBB), favismo (G6PD), fenilcetonúria (PAH). Vários desses genes estão no painel por serem alvos clássicos de estudos de seleção natural.</w:t>
       </w:r>
     </w:p>
     <w:p>
@@ -1705,7 +1697,7 @@
           <w:sz w:val="20"/>
           <w:szCs w:val="20"/>
         </w:rPr>
-        <w:t xml:space="preserve">Importante: nenhum indivíduo foi testado. O número diz para quantas doenças a pergunta pode ser feita com o painel 1240K, não quem tem alguma delas.</w:t>
+        <w:t xml:space="preserve">Importante: nenhum indivíduo foi testado. O número diz para quantas doenças a pergunta pode ser feita com esse painel, não quem tem alguma delas.</w:t>
       </w:r>
     </w:p>
     <w:p>
@@ -2285,7 +2277,7 @@
           <w:sz w:val="22"/>
           <w:szCs w:val="22"/>
         </w:rPr>
-        <w:t xml:space="preserve">Ferramenta Alcance Genômico (comando alcance): </w:t>
+        <w:t xml:space="preserve">Ferramenta hpo-painel: </w:t>
       </w:r>
       <w:r>
         <w:rPr>
@@ -2293,7 +2285,7 @@
           <w:sz w:val="22"/>
           <w:szCs w:val="22"/>
         </w:rPr>
-        <w:t xml:space="preserve">sete comandos, do registro das fontes ao cruzamento, reutilizável para qualquer outro painel de genotipagem de DNA antigo (por exemplo, o Human Origins, com cerca de 600 mil posições).</w:t>
+        <w:t xml:space="preserve">sete comandos, do registro das fontes ao cruzamento, reutilizável para qualquer outro painel de DNA antigo (por exemplo, o Human Origins, com cerca de 600 mil posições).</w:t>
       </w:r>
     </w:p>
     <w:p>
@@ -3983,7 +3975,7 @@
                 <w:sz w:val="20"/>
                 <w:szCs w:val="20"/>
               </w:rPr>
-              <w:t xml:space="preserve">SNV, nenhuma em posição do painel 1240K</w:t>
+              <w:t xml:space="preserve">SNV, nenhuma em posição do painel</w:t>
             </w:r>
           </w:p>
         </w:tc>
@@ -4314,7 +4306,7 @@
                 <w:sz w:val="20"/>
                 <w:szCs w:val="20"/>
               </w:rPr>
-              <w:t xml:space="preserve">Alelo patogênico lido pelo painel 1240K</w:t>
+              <w:t xml:space="preserve">Alelo patogênico lido pelo painel</w:t>
             </w:r>
           </w:p>
         </w:tc>

</xml_diff>